<commit_message>
creation de l'entite ferme et des access denied subscriber
</commit_message>
<xml_diff>
--- a/CAHIER DES CHARGES FONCTIONNEL.docx
+++ b/CAHIER DES CHARGES FONCTIONNEL.docx
@@ -70,7 +70,6 @@
                       <w:lang w:eastAsia="fr-FR"/>
                     </w:rPr>
                   </w:pPr>
-                  <w:proofErr w:type="gramStart"/>
                   <w:r>
                     <w:rPr>
                       <w:rFonts w:ascii="Roboto" w:eastAsia="Times New Roman" w:hAnsi="Roboto" w:cs="Times New Roman"/>
@@ -81,35 +80,8 @@
                       <w:szCs w:val="27"/>
                       <w:lang w:eastAsia="fr-FR"/>
                     </w:rPr>
-                    <w:t>marc</w:t>
+                    <w:t>marc yoba</w:t>
                   </w:r>
-                  <w:proofErr w:type="gramEnd"/>
-                  <w:r>
-                    <w:rPr>
-                      <w:rFonts w:ascii="Roboto" w:eastAsia="Times New Roman" w:hAnsi="Roboto" w:cs="Times New Roman"/>
-                      <w:b/>
-                      <w:bCs/>
-                      <w:color w:val="1F1F1F"/>
-                      <w:sz w:val="27"/>
-                      <w:szCs w:val="27"/>
-                      <w:lang w:eastAsia="fr-FR"/>
-                    </w:rPr>
-                    <w:t xml:space="preserve"> </w:t>
-                  </w:r>
-                  <w:proofErr w:type="spellStart"/>
-                  <w:r>
-                    <w:rPr>
-                      <w:rFonts w:ascii="Roboto" w:eastAsia="Times New Roman" w:hAnsi="Roboto" w:cs="Times New Roman"/>
-                      <w:b/>
-                      <w:bCs/>
-                      <w:color w:val="1F1F1F"/>
-                      <w:sz w:val="27"/>
-                      <w:szCs w:val="27"/>
-                      <w:lang w:eastAsia="fr-FR"/>
-                    </w:rPr>
-                    <w:t>yoba</w:t>
-                  </w:r>
-                  <w:proofErr w:type="spellEnd"/>
                   <w:r>
                     <w:rPr>
                       <w:rFonts w:ascii="Roboto" w:eastAsia="Times New Roman" w:hAnsi="Roboto" w:cs="Times New Roman"/>
@@ -176,29 +148,7 @@
                 <w:szCs w:val="24"/>
                 <w:lang w:eastAsia="fr-FR"/>
               </w:rPr>
-              <w:t xml:space="preserve">21 juil. 2026 </w:t>
-            </w:r>
-            <w:proofErr w:type="gramStart"/>
-            <w:r>
-              <w:rPr>
-                <w:rFonts w:ascii="Roboto" w:eastAsia="Times New Roman" w:hAnsi="Roboto" w:cs="Times New Roman"/>
-                <w:color w:val="5E5E5E"/>
-                <w:sz w:val="24"/>
-                <w:szCs w:val="24"/>
-                <w:lang w:eastAsia="fr-FR"/>
-              </w:rPr>
-              <w:t>11:</w:t>
-            </w:r>
-            <w:proofErr w:type="gramEnd"/>
-            <w:r>
-              <w:rPr>
-                <w:rFonts w:ascii="Roboto" w:eastAsia="Times New Roman" w:hAnsi="Roboto" w:cs="Times New Roman"/>
-                <w:color w:val="5E5E5E"/>
-                <w:sz w:val="24"/>
-                <w:szCs w:val="24"/>
-                <w:lang w:eastAsia="fr-FR"/>
-              </w:rPr>
-              <w:t>27 (il y a 1 jour)</w:t>
+              <w:t>21 juil. 2026 11:27 (il y a 1 jour)</w:t>
             </w:r>
           </w:p>
         </w:tc>
@@ -8279,7 +8229,6 @@
           <w:lang w:eastAsia="fr-FR"/>
         </w:rPr>
       </w:pPr>
-      <w:proofErr w:type="gramStart"/>
       <w:r>
         <w:rPr>
           <w:rFonts w:ascii="Arial" w:eastAsia="Times New Roman" w:hAnsi="Arial" w:cs="Arial"/>
@@ -8290,7 +8239,6 @@
         </w:rPr>
         <w:t>Médicaments expirant</w:t>
       </w:r>
-      <w:proofErr w:type="gramEnd"/>
     </w:p>
     <w:p>
       <w:pPr>

</xml_diff>